<commit_message>
Finalize public GitHub-linked submission
</commit_message>
<xml_diff>
--- a/TranTienThinh_final.docx
+++ b/TranTienThinh_final.docx
@@ -502,10 +502,18 @@
       <w:r>
         <w:rPr>
           <w:b/>
-          <w:color w:val="C62828"/>
         </w:rPr>
-        <w:t>Liên kết GitHub: CHƯA ĐƯỢC CẤU HÌNH — bản này chưa sẵn sàng nộp cho đến khi thay bằng URL repository thật.</w:t>
+        <w:t xml:space="preserve">Liên kết GitHub: </w:t>
       </w:r>
+      <w:hyperlink r:id="rId21">
+        <w:r>
+          <w:rPr>
+            <w:color w:val="0563C1"/>
+            <w:u w:val="single"/>
+          </w:rPr>
+          <w:t>https://github.com/tranthinhhhh/AIoT-D18-WESAD-22110236</w:t>
+        </w:r>
+      </w:hyperlink>
     </w:p>
     <w:p>
       <w:r>
@@ -2175,7 +2183,7 @@
                     <pic:cNvPicPr/>
                   </pic:nvPicPr>
                   <pic:blipFill>
-                    <a:blip r:embed="rId21"/>
+                    <a:blip r:embed="rId22"/>
                     <a:stretch>
                       <a:fillRect/>
                     </a:stretch>
@@ -3749,7 +3757,7 @@
                     <pic:cNvPicPr/>
                   </pic:nvPicPr>
                   <pic:blipFill>
-                    <a:blip r:embed="rId22"/>
+                    <a:blip r:embed="rId23"/>
                     <a:stretch>
                       <a:fillRect/>
                     </a:stretch>
@@ -4433,7 +4441,7 @@
                     <pic:cNvPicPr/>
                   </pic:nvPicPr>
                   <pic:blipFill>
-                    <a:blip r:embed="rId23"/>
+                    <a:blip r:embed="rId24"/>
                     <a:stretch>
                       <a:fillRect/>
                     </a:stretch>
@@ -4507,7 +4515,7 @@
                     <pic:cNvPicPr/>
                   </pic:nvPicPr>
                   <pic:blipFill>
-                    <a:blip r:embed="rId24"/>
+                    <a:blip r:embed="rId25"/>
                     <a:stretch>
                       <a:fillRect/>
                     </a:stretch>
@@ -4555,7 +4563,7 @@
                     <pic:cNvPicPr/>
                   </pic:nvPicPr>
                   <pic:blipFill>
-                    <a:blip r:embed="rId25"/>
+                    <a:blip r:embed="rId26"/>
                     <a:stretch>
                       <a:fillRect/>
                     </a:stretch>
@@ -4629,7 +4637,7 @@
                     <pic:cNvPicPr/>
                   </pic:nvPicPr>
                   <pic:blipFill>
-                    <a:blip r:embed="rId26"/>
+                    <a:blip r:embed="rId27"/>
                     <a:stretch>
                       <a:fillRect/>
                     </a:stretch>
@@ -4677,7 +4685,7 @@
                     <pic:cNvPicPr/>
                   </pic:nvPicPr>
                   <pic:blipFill>
-                    <a:blip r:embed="rId27"/>
+                    <a:blip r:embed="rId28"/>
                     <a:stretch>
                       <a:fillRect/>
                     </a:stretch>
@@ -5127,7 +5135,7 @@
                     <pic:cNvPicPr/>
                   </pic:nvPicPr>
                   <pic:blipFill>
-                    <a:blip r:embed="rId28"/>
+                    <a:blip r:embed="rId29"/>
                     <a:stretch>
                       <a:fillRect/>
                     </a:stretch>
@@ -6024,10 +6032,18 @@
       <w:r>
         <w:rPr>
           <w:b/>
-          <w:color w:val="C62828"/>
         </w:rPr>
-        <w:t>Trạng thái GitHub: CHƯA CÓ REMOTE ĐƯỢC XÁC MINH. Cần thay dòng này bằng liên kết thật trước khi nộp.</w:t>
+        <w:t xml:space="preserve">Repository mã nguồn và artifact: </w:t>
       </w:r>
+      <w:hyperlink r:id="rId21">
+        <w:r>
+          <w:rPr>
+            <w:color w:val="0563C1"/>
+            <w:u w:val="single"/>
+          </w:rPr>
+          <w:t>https://github.com/tranthinhhhh/AIoT-D18-WESAD-22110236</w:t>
+        </w:r>
+      </w:hyperlink>
     </w:p>
     <w:p>
       <w:r>

</xml_diff>